<commit_message>
Docs: agent usage tracking, SharePoint access steps; fix lab script on PS 5.1
README and implementation guide: document the new registry columns, the
CopilotInactiveAgents list, new app settings, usage tracking/matching, and new
troubleshooting entries (401 token cache, 400 missing/misnamed columns).
Correct the claim that Post-Deploy.ps1 grants SharePoint access (it only grants
ActivityFeed.Read) and the nonexistent -SharePointSiteUrl parameter; add manual
Sites.Selected + site grant steps.

Invoke-LabFunction.ps1: suppress Azure CLI Python warnings so stderr output does
not terminate the script in Windows PowerShell 5.1.

Co-authored-by: Copilot <223556219+Copilot@users.noreply.github.com>
</commit_message>
<xml_diff>
--- a/Full_Implementation_Guide_No_Bicep.docx
+++ b/Full_Implementation_Guide_No_Bicep.docx
@@ -1407,34 +1407,7 @@
         <w:rPr>
           <w:rStyle w:val="NormalTok"/>
         </w:rPr>
-        <w:t xml:space="preserve">CloudEnvironment Commercial `</w:t>
-      </w:r>
-      <w:r>
-        <w:br/>
-      </w:r>
-      <w:r>
-        <w:rPr>
-          <w:rStyle w:val="NormalTok"/>
-        </w:rPr>
-        <w:t xml:space="preserve">  </w:t>
-      </w:r>
-      <w:r>
-        <w:rPr>
-          <w:rStyle w:val="OperatorTok"/>
-        </w:rPr>
-        <w:t xml:space="preserve">-</w:t>
-      </w:r>
-      <w:r>
-        <w:rPr>
-          <w:rStyle w:val="NormalTok"/>
-        </w:rPr>
-        <w:t xml:space="preserve">SharePointSiteUrl </w:t>
-      </w:r>
-      <w:r>
-        <w:rPr>
-          <w:rStyle w:val="StringTok"/>
-        </w:rPr>
-        <w:t xml:space="preserve">"https://contoso.sharepoint.com/sites/CopilotReporting"</w:t>
+        <w:t xml:space="preserve">CloudEnvironment Commercial</w:t>
       </w:r>
     </w:p>
     <w:p>
@@ -1442,7 +1415,50 @@
         <w:pStyle w:val="FirstParagraph"/>
       </w:pPr>
       <w:r>
-        <w:t xml:space="preserve">A browser sign-in popup will appear Ã¢â‚¬” check your taskbar. The script grants:</w:t>
+        <w:t xml:space="preserve">A browser sign-in popup will appear — check your taskbar. The script grants </w:t>
+      </w:r>
+      <w:r>
+        <w:rPr>
+          <w:rStyle w:val="VerbatimChar"/>
+        </w:rPr>
+        <w:t xml:space="preserve">ActivityFeed.Read</w:t>
+      </w:r>
+      <w:r>
+        <w:t xml:space="preserve"> to the Function App managed identity (for the Office 365 Audit API). It does </w:t>
+      </w:r>
+      <w:r>
+        <w:rPr>
+          <w:b/>
+        </w:rPr>
+        <w:t xml:space="preserve">not</w:t>
+      </w:r>
+      <w:r>
+        <w:t xml:space="preserve"> grant SharePoint access — complete Step 2b before using the SharePoint lists.</w:t>
+      </w:r>
+    </w:p>
+    <w:p>
+      <w:pPr>
+        <w:pStyle w:val="Heading2"/>
+      </w:pPr>
+      <w:r>
+        <w:t xml:space="preserve">Step 2b: Grant SharePoint Site Access</w:t>
+      </w:r>
+    </w:p>
+    <w:p>
+      <w:pPr>
+        <w:pStyle w:val="FirstParagraph"/>
+      </w:pPr>
+      <w:r>
+        <w:t xml:space="preserve">The Function App identity needs two things before it can write to the reporting site. Without them, every SharePoint call fails with </w:t>
+      </w:r>
+      <w:r>
+        <w:rPr>
+          <w:rStyle w:val="VerbatimChar"/>
+        </w:rPr>
+        <w:t xml:space="preserve">401 Unauthorized</w:t>
+      </w:r>
+      <w:r>
+        <w:t xml:space="preserve">.</w:t>
       </w:r>
     </w:p>
     <w:p>
@@ -1455,12 +1471,68 @@
       </w:pPr>
       <w:r>
         <w:rPr>
-          <w:rStyle w:val="VerbatimChar"/>
-        </w:rPr>
-        <w:t xml:space="preserve">ActivityFeed.Read</w:t>
-      </w:r>
-      <w:r>
-        <w:t xml:space="preserve"> to the Function App managed identity</w:t>
+          <w:b/>
+        </w:rPr>
+        <w:t xml:space="preserve">App role:</w:t>
+      </w:r>
+      <w:r>
+        <w:t xml:space="preserve"> assign </w:t>
+      </w:r>
+      <w:r>
+        <w:rPr>
+          <w:rStyle w:val="VerbatimChar"/>
+        </w:rPr>
+        <w:t xml:space="preserve">Sites.Selected</w:t>
+      </w:r>
+      <w:r>
+        <w:t xml:space="preserve"> on “Office 365 SharePoint Online” to the identity. Needs an account that can manage app role assignments.</w:t>
+      </w:r>
+    </w:p>
+    <w:p>
+      <w:pPr>
+        <w:pStyle w:val="SourceCode"/>
+      </w:pPr>
+      <w:r>
+        <w:rPr>
+          <w:rStyle w:val="NormalTok"/>
+        </w:rPr>
+        <w:t xml:space="preserve">Connect-MgGraph -Scopes "AppRoleAssignment.ReadWrite.All" -TenantId "&lt;tenant-id&gt;"</w:t>
+      </w:r>
+      <w:r>
+        <w:br/>
+      </w:r>
+      <w:r>
+        <w:rPr>
+          <w:rStyle w:val="NormalTok"/>
+        </w:rPr>
+        <w:t xml:space="preserve">$spo  = (Invoke-MgGraphRequest -Method GET -Uri "https://graph.microsoft.com/v1.0/servicePrincipals?`$filter=appId eq '00000003-0000-0ff1-ce00-000000000000'").value[0]</w:t>
+      </w:r>
+      <w:r>
+        <w:br/>
+      </w:r>
+      <w:r>
+        <w:rPr>
+          <w:rStyle w:val="NormalTok"/>
+        </w:rPr>
+        <w:t xml:space="preserve">$role = $spo.appRoles | Where-Object value -eq 'Sites.Selected'</w:t>
+      </w:r>
+      <w:r>
+        <w:br/>
+      </w:r>
+      <w:r>
+        <w:rPr>
+          <w:rStyle w:val="NormalTok"/>
+        </w:rPr>
+        <w:t xml:space="preserve">Invoke-MgGraphRequest -Method POST -Uri "https://graph.microsoft.com/v1.0/servicePrincipals/&lt;object-id&gt;/appRoleAssignments" `</w:t>
+      </w:r>
+      <w:r>
+        <w:br/>
+      </w:r>
+      <w:r>
+        <w:rPr>
+          <w:rStyle w:val="NormalTok"/>
+        </w:rPr>
+        <w:t xml:space="preserve">  -Body (@{ principalId = "&lt;object-id&gt;"; resourceId = $spo.id; appRoleId = $role.id } | ConvertTo-Json) -ContentType "application/json"</w:t>
       </w:r>
     </w:p>
     <w:p>
@@ -1473,24 +1545,120 @@
       </w:pPr>
       <w:r>
         <w:rPr>
-          <w:rStyle w:val="VerbatimChar"/>
-        </w:rPr>
-        <w:t xml:space="preserve">Sites.Selected</w:t>
-      </w:r>
-      <w:r>
-        <w:t xml:space="preserve"> (Azure AD app role) scoped to only the named site</w:t>
-      </w:r>
-    </w:p>
-    <w:p>
-      <w:pPr>
-        <w:pStyle w:val="Compact"/>
-        <w:numPr>
-          <w:ilvl w:val="0"/>
-          <w:numId w:val="1005"/>
-        </w:numPr>
-      </w:pPr>
-      <w:r>
-        <w:t xml:space="preserve">Site-level write access</w:t>
+          <w:b/>
+        </w:rPr>
+        <w:t xml:space="preserve">Site grant:</w:t>
+      </w:r>
+      <w:r>
+        <w:t xml:space="preserve"> give the identity </w:t>
+      </w:r>
+      <w:r>
+        <w:rPr>
+          <w:rStyle w:val="VerbatimChar"/>
+        </w:rPr>
+        <w:t xml:space="preserve">write</w:t>
+      </w:r>
+      <w:r>
+        <w:t xml:space="preserve"> on the reporting site. Needs a sign-in with </w:t>
+      </w:r>
+      <w:r>
+        <w:rPr>
+          <w:rStyle w:val="VerbatimChar"/>
+        </w:rPr>
+        <w:t xml:space="preserve">Sites.FullControl.All</w:t>
+      </w:r>
+      <w:r>
+        <w:t xml:space="preserve"> (admin consent).</w:t>
+      </w:r>
+    </w:p>
+    <w:p>
+      <w:pPr>
+        <w:pStyle w:val="SourceCode"/>
+      </w:pPr>
+      <w:r>
+        <w:rPr>
+          <w:rStyle w:val="NormalTok"/>
+        </w:rPr>
+        <w:t xml:space="preserve">Connect-MgGraph -Scopes "Sites.FullControl.All" -TenantId "&lt;tenant-id&gt;"</w:t>
+      </w:r>
+      <w:r>
+        <w:br/>
+      </w:r>
+      <w:r>
+        <w:rPr>
+          <w:rStyle w:val="NormalTok"/>
+        </w:rPr>
+        <w:t xml:space="preserve">$site = Invoke-MgGraphRequest -Method GET -Uri "https://graph.microsoft.com/v1.0/sites/&lt;tenant&gt;.sharepoint.com:/sites/CopilotReporting"</w:t>
+      </w:r>
+      <w:r>
+        <w:br/>
+      </w:r>
+      <w:r>
+        <w:rPr>
+          <w:rStyle w:val="NormalTok"/>
+        </w:rPr>
+        <w:t xml:space="preserve">$body = @{ roles = @("write"); grantedToIdentities = @(@{ application = @{ id = "&lt;client-id&gt;"; displayName = "&lt;function-app-name&gt;" } }) } | ConvertTo-Json -Depth 5</w:t>
+      </w:r>
+      <w:r>
+        <w:br/>
+      </w:r>
+      <w:r>
+        <w:rPr>
+          <w:rStyle w:val="NormalTok"/>
+        </w:rPr>
+        <w:t xml:space="preserve">Invoke-MgGraphRequest -Method POST -Uri "https://graph.microsoft.com/v1.0/sites/$($site.id)/permissions" -Body $body -ContentType "application/json"</w:t>
+      </w:r>
+    </w:p>
+    <w:p>
+      <w:pPr>
+        <w:pStyle w:val="FirstParagraph"/>
+      </w:pPr>
+      <w:r>
+        <w:t xml:space="preserve">The client ID is the identity’s application (client) ID, not its object ID. To confirm, list </w:t>
+      </w:r>
+      <w:r>
+        <w:rPr>
+          <w:rStyle w:val="VerbatimChar"/>
+        </w:rPr>
+        <w:t xml:space="preserve">/sites/&lt;site-id&gt;/permissions</w:t>
+      </w:r>
+      <w:r>
+        <w:t xml:space="preserve"> and check the app has </w:t>
+      </w:r>
+      <w:r>
+        <w:rPr>
+          <w:rStyle w:val="VerbatimChar"/>
+        </w:rPr>
+        <w:t xml:space="preserve">write</w:t>
+      </w:r>
+      <w:r>
+        <w:t xml:space="preserve">.</w:t>
+      </w:r>
+    </w:p>
+    <w:p>
+      <w:pPr>
+        <w:pStyle w:val="BlockText"/>
+      </w:pPr>
+      <w:r>
+        <w:t xml:space="preserve">If your tenant requires passkey sign-in, run </w:t>
+      </w:r>
+      <w:r>
+        <w:rPr>
+          <w:rStyle w:val="VerbatimChar"/>
+        </w:rPr>
+        <w:t xml:space="preserve">Set-MgGraphOption -EnableLoginByWAM $true</w:t>
+      </w:r>
+      <w:r>
+        <w:t xml:space="preserve"> before </w:t>
+      </w:r>
+      <w:r>
+        <w:rPr>
+          <w:rStyle w:val="VerbatimChar"/>
+        </w:rPr>
+        <w:t xml:space="preserve">Connect-MgGraph</w:t>
+      </w:r>
+      <w:r>
+        <w:t xml:space="preserve"> so the Windows broker handles the sign-in. Managed-identity tokens are cached for up to about 24 hours, so after granting a new role the app can keep returning 401 until the cached token expires.</w:t>
       </w:r>
     </w:p>
     <w:p>
@@ -1951,10 +2119,7 @@
         <w:t xml:space="preserve">StartSubscription</w:t>
       </w:r>
       <w:r>
-        <w:t xml:space="preserve"> Ã¢â‚¬” activates the audit subscription (one-time, idempotent)</w:t>
-      </w:r>
-      <w:r>
-        <w:t xml:space="preserve"> - </w:t>
+        <w:t xml:space="preserve"> Ã¢â‚¬” activates the audit subscription (one-time, idempotent) - </w:t>
       </w:r>
       <w:r>
         <w:rPr>
@@ -2096,7 +2261,7 @@
         <w:pStyle w:val="FirstParagraph"/>
       </w:pPr>
       <w:r>
-        <w:t xml:space="preserve">Create these five lists at your SharePoint site. Column names must match exactly.</w:t>
+        <w:t xml:space="preserve">Create these seven lists at your SharePoint site. Column names must match exactly.</w:t>
       </w:r>
     </w:p>
     <w:p>
@@ -3078,7 +3243,87 @@
           </w:p>
         </w:tc>
       </w:tr>
+      <w:tr>
+        <w:tc>
+          <w:tcPr/>
+          <w:p>
+            <w:pPr>
+              <w:pStyle w:val="Compact"/>
+            </w:pPr>
+            <w:r>
+              <w:t xml:space="preserve">LastUsedDate</w:t>
+            </w:r>
+          </w:p>
+        </w:tc>
+        <w:tc>
+          <w:tcPr/>
+          <w:p>
+            <w:pPr>
+              <w:pStyle w:val="Compact"/>
+            </w:pPr>
+            <w:r>
+              <w:t xml:space="preserve">Date and time (include time) — filled by ExportAdoptionMetrics</w:t>
+            </w:r>
+          </w:p>
+        </w:tc>
+      </w:tr>
+      <w:tr>
+        <w:tc>
+          <w:tcPr/>
+          <w:p>
+            <w:pPr>
+              <w:pStyle w:val="Compact"/>
+            </w:pPr>
+            <w:r>
+              <w:t xml:space="preserve">UseCount</w:t>
+            </w:r>
+          </w:p>
+        </w:tc>
+        <w:tc>
+          <w:tcPr/>
+          <w:p>
+            <w:pPr>
+              <w:pStyle w:val="Compact"/>
+            </w:pPr>
+            <w:r>
+              <w:t xml:space="preserve">Number — filled by ExportAdoptionMetrics</w:t>
+            </w:r>
+          </w:p>
+        </w:tc>
+      </w:tr>
+      <w:tr>
+        <w:tc>
+          <w:tcPr/>
+          <w:p>
+            <w:pPr>
+              <w:pStyle w:val="Compact"/>
+            </w:pPr>
+            <w:r>
+              <w:t xml:space="preserve">AgentPlatformID</w:t>
+            </w:r>
+          </w:p>
+        </w:tc>
+        <w:tc>
+          <w:tcPr/>
+          <w:p>
+            <w:pPr>
+              <w:pStyle w:val="Compact"/>
+            </w:pPr>
+            <w:r>
+              <w:t xml:space="preserve">Single line of text — filled automatically on first match (note the capital “ID”)</w:t>
+            </w:r>
+          </w:p>
+        </w:tc>
+      </w:tr>
     </w:tbl>
+    <w:p>
+      <w:pPr>
+        <w:pStyle w:val="BlockText"/>
+      </w:pPr>
+      <w:r>
+        <w:t xml:space="preserve">Column names must be typed exactly, with no spaces, and never renamed after creation. SharePoint fixes the internal name when the column is created, and the function writes to that internal name (it is case-sensitive). A column created with a typo and then renamed keeps the typo internally and the function will fail with “field or property does not exist”. Delete and recreate it instead.</w:t>
+      </w:r>
+    </w:p>
     <w:p>
       <w:pPr>
         <w:pStyle w:val="Heading2"/>
@@ -3310,6 +3555,401 @@
         </w:tc>
       </w:tr>
     </w:tbl>
+    <w:p>
+      <w:pPr>
+        <w:pStyle w:val="Heading2"/>
+      </w:pPr>
+      <w:r>
+        <w:t xml:space="preserve">List 7: CopilotInactiveAgents</w:t>
+      </w:r>
+    </w:p>
+    <w:p>
+      <w:pPr>
+        <w:pStyle w:val="FirstParagraph"/>
+      </w:pPr>
+      <w:r>
+        <w:t xml:space="preserve">Rewritten from scratch on every </w:t>
+      </w:r>
+      <w:r>
+        <w:rPr>
+          <w:rStyle w:val="VerbatimChar"/>
+        </w:rPr>
+        <w:t xml:space="preserve">ExportAdoptionMetrics</w:t>
+      </w:r>
+      <w:r>
+        <w:t xml:space="preserve"> run (every 4 hours). It holds one </w:t>
+      </w:r>
+      <w:r>
+        <w:rPr>
+          <w:rStyle w:val="VerbatimChar"/>
+        </w:rPr>
+        <w:t xml:space="preserve">Summary</w:t>
+      </w:r>
+      <w:r>
+        <w:t xml:space="preserve"> row (total agents, how many are inactive) plus one </w:t>
+      </w:r>
+      <w:r>
+        <w:rPr>
+          <w:rStyle w:val="VerbatimChar"/>
+        </w:rPr>
+        <w:t xml:space="preserve">InactiveAgent</w:t>
+      </w:r>
+      <w:r>
+        <w:t xml:space="preserve"> row for every registry agent not used in the last </w:t>
+      </w:r>
+      <w:r>
+        <w:rPr>
+          <w:rStyle w:val="VerbatimChar"/>
+        </w:rPr>
+        <w:t xml:space="preserve">AGENT_INACTIVE_DAYS</w:t>
+      </w:r>
+      <w:r>
+        <w:t xml:space="preserve"> days (default 60). Agents that have never been used are measured from their </w:t>
+      </w:r>
+      <w:r>
+        <w:rPr>
+          <w:rStyle w:val="VerbatimChar"/>
+        </w:rPr>
+        <w:t xml:space="preserve">CreatedDate</w:t>
+      </w:r>
+      <w:r>
+        <w:t xml:space="preserve">. Do not store anything you want to keep in this list.</w:t>
+      </w:r>
+    </w:p>
+    <w:tbl>
+      <w:tblPr>
+        <w:tblStyle w:val="Table"/>
+        <w:tblW w:type="auto" w:w="0"/>
+        <w:tblLook w:firstRow="1" w:lastRow="0" w:firstColumn="0" w:lastColumn="0" w:noHBand="0" w:noVBand="0" w:val="0020"/>
+      </w:tblPr>
+      <w:tblGrid>
+        <w:gridCol w:w="3960"/>
+        <w:gridCol w:w="3960"/>
+      </w:tblGrid>
+      <w:tr>
+        <w:trPr>
+          <w:tblHeader w:val="on"/>
+        </w:trPr>
+        <w:tc>
+          <w:tcPr/>
+          <w:p>
+            <w:pPr>
+              <w:pStyle w:val="Compact"/>
+            </w:pPr>
+            <w:r>
+              <w:t xml:space="preserve">Column</w:t>
+            </w:r>
+          </w:p>
+        </w:tc>
+        <w:tc>
+          <w:tcPr/>
+          <w:p>
+            <w:pPr>
+              <w:pStyle w:val="Compact"/>
+            </w:pPr>
+            <w:r>
+              <w:t xml:space="preserve">Type</w:t>
+            </w:r>
+          </w:p>
+        </w:tc>
+      </w:tr>
+      <w:tr>
+        <w:tc>
+          <w:tcPr/>
+          <w:p>
+            <w:pPr>
+              <w:pStyle w:val="Compact"/>
+            </w:pPr>
+            <w:r>
+              <w:t xml:space="preserve">Title</w:t>
+            </w:r>
+          </w:p>
+        </w:tc>
+        <w:tc>
+          <w:tcPr/>
+          <w:p>
+            <w:pPr>
+              <w:pStyle w:val="Compact"/>
+            </w:pPr>
+            <w:r>
+              <w:t xml:space="preserve">Single line of text (built-in; holds “Summary” or the agent name)</w:t>
+            </w:r>
+          </w:p>
+        </w:tc>
+      </w:tr>
+      <w:tr>
+        <w:tc>
+          <w:tcPr/>
+          <w:p>
+            <w:pPr>
+              <w:pStyle w:val="Compact"/>
+            </w:pPr>
+            <w:r>
+              <w:t xml:space="preserve">RowType</w:t>
+            </w:r>
+          </w:p>
+        </w:tc>
+        <w:tc>
+          <w:tcPr/>
+          <w:p>
+            <w:pPr>
+              <w:pStyle w:val="Compact"/>
+            </w:pPr>
+            <w:r>
+              <w:t xml:space="preserve">Single line of text (Summary or InactiveAgent)</w:t>
+            </w:r>
+          </w:p>
+        </w:tc>
+      </w:tr>
+      <w:tr>
+        <w:tc>
+          <w:tcPr/>
+          <w:p>
+            <w:pPr>
+              <w:pStyle w:val="Compact"/>
+            </w:pPr>
+            <w:r>
+              <w:t xml:space="preserve">AgentName</w:t>
+            </w:r>
+          </w:p>
+        </w:tc>
+        <w:tc>
+          <w:tcPr/>
+          <w:p>
+            <w:pPr>
+              <w:pStyle w:val="Compact"/>
+            </w:pPr>
+            <w:r>
+              <w:t xml:space="preserve">Single line of text</w:t>
+            </w:r>
+          </w:p>
+        </w:tc>
+      </w:tr>
+      <w:tr>
+        <w:tc>
+          <w:tcPr/>
+          <w:p>
+            <w:pPr>
+              <w:pStyle w:val="Compact"/>
+            </w:pPr>
+            <w:r>
+              <w:t xml:space="preserve">SiteUrl</w:t>
+            </w:r>
+          </w:p>
+        </w:tc>
+        <w:tc>
+          <w:tcPr/>
+          <w:p>
+            <w:pPr>
+              <w:pStyle w:val="Compact"/>
+            </w:pPr>
+            <w:r>
+              <w:t xml:space="preserve">Single line of text</w:t>
+            </w:r>
+          </w:p>
+        </w:tc>
+      </w:tr>
+      <w:tr>
+        <w:tc>
+          <w:tcPr/>
+          <w:p>
+            <w:pPr>
+              <w:pStyle w:val="Compact"/>
+            </w:pPr>
+            <w:r>
+              <w:t xml:space="preserve">CreatedDate</w:t>
+            </w:r>
+          </w:p>
+        </w:tc>
+        <w:tc>
+          <w:tcPr/>
+          <w:p>
+            <w:pPr>
+              <w:pStyle w:val="Compact"/>
+            </w:pPr>
+            <w:r>
+              <w:t xml:space="preserve">Date and time (include time)</w:t>
+            </w:r>
+          </w:p>
+        </w:tc>
+      </w:tr>
+      <w:tr>
+        <w:tc>
+          <w:tcPr/>
+          <w:p>
+            <w:pPr>
+              <w:pStyle w:val="Compact"/>
+            </w:pPr>
+            <w:r>
+              <w:t xml:space="preserve">LastUsedDate</w:t>
+            </w:r>
+          </w:p>
+        </w:tc>
+        <w:tc>
+          <w:tcPr/>
+          <w:p>
+            <w:pPr>
+              <w:pStyle w:val="Compact"/>
+            </w:pPr>
+            <w:r>
+              <w:t xml:space="preserve">Date and time (include time)</w:t>
+            </w:r>
+          </w:p>
+        </w:tc>
+      </w:tr>
+      <w:tr>
+        <w:tc>
+          <w:tcPr/>
+          <w:p>
+            <w:pPr>
+              <w:pStyle w:val="Compact"/>
+            </w:pPr>
+            <w:r>
+              <w:t xml:space="preserve">UseCount</w:t>
+            </w:r>
+          </w:p>
+        </w:tc>
+        <w:tc>
+          <w:tcPr/>
+          <w:p>
+            <w:pPr>
+              <w:pStyle w:val="Compact"/>
+            </w:pPr>
+            <w:r>
+              <w:t xml:space="preserve">Number</w:t>
+            </w:r>
+          </w:p>
+        </w:tc>
+      </w:tr>
+      <w:tr>
+        <w:tc>
+          <w:tcPr/>
+          <w:p>
+            <w:pPr>
+              <w:pStyle w:val="Compact"/>
+            </w:pPr>
+            <w:r>
+              <w:t xml:space="preserve">DaysInactive</w:t>
+            </w:r>
+          </w:p>
+        </w:tc>
+        <w:tc>
+          <w:tcPr/>
+          <w:p>
+            <w:pPr>
+              <w:pStyle w:val="Compact"/>
+            </w:pPr>
+            <w:r>
+              <w:t xml:space="preserve">Number</w:t>
+            </w:r>
+          </w:p>
+        </w:tc>
+      </w:tr>
+      <w:tr>
+        <w:tc>
+          <w:tcPr/>
+          <w:p>
+            <w:pPr>
+              <w:pStyle w:val="Compact"/>
+            </w:pPr>
+            <w:r>
+              <w:t xml:space="preserve">TotalAgents</w:t>
+            </w:r>
+          </w:p>
+        </w:tc>
+        <w:tc>
+          <w:tcPr/>
+          <w:p>
+            <w:pPr>
+              <w:pStyle w:val="Compact"/>
+            </w:pPr>
+            <w:r>
+              <w:t xml:space="preserve">Number (Summary row only)</w:t>
+            </w:r>
+          </w:p>
+        </w:tc>
+      </w:tr>
+      <w:tr>
+        <w:tc>
+          <w:tcPr/>
+          <w:p>
+            <w:pPr>
+              <w:pStyle w:val="Compact"/>
+            </w:pPr>
+            <w:r>
+              <w:t xml:space="preserve">InactiveCount</w:t>
+            </w:r>
+          </w:p>
+        </w:tc>
+        <w:tc>
+          <w:tcPr/>
+          <w:p>
+            <w:pPr>
+              <w:pStyle w:val="Compact"/>
+            </w:pPr>
+            <w:r>
+              <w:t xml:space="preserve">Number (Summary row only) — must be Number, not text</w:t>
+            </w:r>
+          </w:p>
+        </w:tc>
+      </w:tr>
+      <w:tr>
+        <w:tc>
+          <w:tcPr/>
+          <w:p>
+            <w:pPr>
+              <w:pStyle w:val="Compact"/>
+            </w:pPr>
+            <w:r>
+              <w:t xml:space="preserve">ThresholdDays</w:t>
+            </w:r>
+          </w:p>
+        </w:tc>
+        <w:tc>
+          <w:tcPr/>
+          <w:p>
+            <w:pPr>
+              <w:pStyle w:val="Compact"/>
+            </w:pPr>
+            <w:r>
+              <w:t xml:space="preserve">Number (Summary row only)</w:t>
+            </w:r>
+          </w:p>
+        </w:tc>
+      </w:tr>
+      <w:tr>
+        <w:tc>
+          <w:tcPr/>
+          <w:p>
+            <w:pPr>
+              <w:pStyle w:val="Compact"/>
+            </w:pPr>
+            <w:r>
+              <w:t xml:space="preserve">RunDate</w:t>
+            </w:r>
+          </w:p>
+        </w:tc>
+        <w:tc>
+          <w:tcPr/>
+          <w:p>
+            <w:pPr>
+              <w:pStyle w:val="Compact"/>
+            </w:pPr>
+            <w:r>
+              <w:t xml:space="preserve">Date and time (include time; Summary row only)</w:t>
+            </w:r>
+          </w:p>
+        </w:tc>
+      </w:tr>
+    </w:tbl>
+    <w:p>
+      <w:pPr>
+        <w:pStyle w:val="BlockText"/>
+      </w:pPr>
+      <w:r>
+        <w:t xml:space="preserve">Columns used only by the Summary row simply stay blank on agent rows — do not mark any column as required. Optional views: “Summary” (filter RowType = Summary) and “Inactive Agents” (filter RowType = InactiveAgent, sorted by DaysInactive descending). A view loses a column if that column is deleted and recreated, so re-add it to the view afterwards.</w:t>
+      </w:r>
+    </w:p>
     <w:p>
       <w:r>
         <w:pict>
@@ -3725,6 +4365,129 @@
               <w:rPr>
                 <w:rStyle w:val="VerbatimChar"/>
               </w:rPr>
+              <w:t xml:space="preserve">SHAREPOINT_INACTIVE_AGENT_LIST</w:t>
+            </w:r>
+          </w:p>
+        </w:tc>
+        <w:tc>
+          <w:tcPr/>
+          <w:p>
+            <w:pPr>
+              <w:pStyle w:val="Compact"/>
+            </w:pPr>
+            <w:r>
+              <w:rPr>
+                <w:rStyle w:val="VerbatimChar"/>
+              </w:rPr>
+              <w:t xml:space="preserve">CopilotInactiveAgents</w:t>
+            </w:r>
+          </w:p>
+        </w:tc>
+        <w:tc>
+          <w:tcPr/>
+          <w:p>
+            <w:pPr>
+              <w:pStyle w:val="Compact"/>
+            </w:pPr>
+            <w:r>
+              <w:t xml:space="preserve">Both modes</w:t>
+            </w:r>
+          </w:p>
+        </w:tc>
+      </w:tr>
+      <w:tr>
+        <w:tc>
+          <w:tcPr/>
+          <w:p>
+            <w:pPr>
+              <w:pStyle w:val="Compact"/>
+            </w:pPr>
+            <w:r>
+              <w:rPr>
+                <w:rStyle w:val="VerbatimChar"/>
+              </w:rPr>
+              <w:t xml:space="preserve">AGENT_INACTIVE_DAYS</w:t>
+            </w:r>
+          </w:p>
+        </w:tc>
+        <w:tc>
+          <w:tcPr/>
+          <w:p>
+            <w:pPr>
+              <w:pStyle w:val="Compact"/>
+            </w:pPr>
+            <w:r>
+              <w:rPr>
+                <w:rStyle w:val="VerbatimChar"/>
+              </w:rPr>
+              <w:t xml:space="preserve">60</w:t>
+            </w:r>
+          </w:p>
+        </w:tc>
+        <w:tc>
+          <w:tcPr/>
+          <w:p>
+            <w:pPr>
+              <w:pStyle w:val="Compact"/>
+            </w:pPr>
+            <w:r>
+              <w:t xml:space="preserve">Both modes (days without use before an agent is listed as inactive)</w:t>
+            </w:r>
+          </w:p>
+        </w:tc>
+      </w:tr>
+      <w:tr>
+        <w:tc>
+          <w:tcPr/>
+          <w:p>
+            <w:pPr>
+              <w:pStyle w:val="Compact"/>
+            </w:pPr>
+            <w:r>
+              <w:rPr>
+                <w:rStyle w:val="VerbatimChar"/>
+              </w:rPr>
+              <w:t xml:space="preserve">AGENT_USAGE_REBUILD_DAYS</w:t>
+            </w:r>
+          </w:p>
+        </w:tc>
+        <w:tc>
+          <w:tcPr/>
+          <w:p>
+            <w:pPr>
+              <w:pStyle w:val="Compact"/>
+            </w:pPr>
+            <w:r>
+              <w:rPr>
+                <w:rStyle w:val="VerbatimChar"/>
+              </w:rPr>
+              <w:t xml:space="preserve">0</w:t>
+            </w:r>
+          </w:p>
+        </w:tc>
+        <w:tc>
+          <w:tcPr/>
+          <w:p>
+            <w:pPr>
+              <w:pStyle w:val="Compact"/>
+            </w:pPr>
+            <w:r>
+              <w:t xml:space="preserve">Optional. Set to e.g. 45 for a one-time usage rebuild, then reset to 0</w:t>
+            </w:r>
+          </w:p>
+        </w:tc>
+      </w:tr>
+      <w:tr>
+        <w:tc>
+          <w:tcPr/>
+          <w:p>
+            <w:pPr>
+              <w:pStyle w:val="Compact"/>
+            </w:pPr>
+            <w:r>
+              <w:rPr>
+                <w:rStyle w:val="VerbatimChar"/>
+              </w:rPr>
               <w:t xml:space="preserve">METRICS_LOOKBACK_DAYS</w:t>
             </w:r>
           </w:p>
@@ -4019,7 +4782,16 @@
         <w:t xml:space="preserve">append-only</w:t>
       </w:r>
       <w:r>
-        <w:t xml:space="preserve"> Ã¢â‚¬” it never deletes or overwrites entries. Running it multiple times is safe due to deduplication by </w:t>
+        <w:t xml:space="preserve"> Ã¢â‚¬”         it never deletes or overwrites entries (only </w:t>
+      </w:r>
+      <w:r>
+        <w:rPr>
+          <w:rStyle w:val="VerbatimChar"/>
+        </w:rPr>
+        <w:t xml:space="preserve">ExportAdoptionMetrics</w:t>
+      </w:r>
+      <w:r>
+        <w:t xml:space="preserve"> later fills in the usage columns). Running it multiple times is safe due to deduplication by </w:t>
       </w:r>
       <w:r>
         <w:rPr>
@@ -4029,6 +4801,39 @@
       </w:r>
       <w:r>
         <w:t xml:space="preserve">.</w:t>
+      </w:r>
+    </w:p>
+    <w:p>
+      <w:pPr>
+        <w:pStyle w:val="BodyText"/>
+      </w:pPr>
+      <w:r>
+        <w:rPr>
+          <w:b/>
+          <w:bCs/>
+        </w:rPr>
+        <w:t xml:space="preserve">Agent usage history (optional): </w:t>
+      </w:r>
+      <w:r>
+        <w:t xml:space="preserve">LastUsedDate, UseCount and the inactive-agent list are built from log blobs processed after this feature is deployed. To include earlier history already in ADLS, set </w:t>
+      </w:r>
+      <w:r>
+        <w:rPr>
+          <w:rStyle w:val="VerbatimChar"/>
+        </w:rPr>
+        <w:t xml:space="preserve">AGENT_USAGE_REBUILD_DAYS</w:t>
+      </w:r>
+      <w:r>
+        <w:t xml:space="preserve"> (for example 45), run ExportAdoptionMetrics once, then set it back to </w:t>
+      </w:r>
+      <w:r>
+        <w:rPr>
+          <w:rStyle w:val="VerbatimChar"/>
+        </w:rPr>
+        <w:t xml:space="preserve">0</w:t>
+      </w:r>
+      <w:r>
+        <w:t xml:space="preserve">. The rebuild rescans every blob in the window and must finish inside the 10-minute function timeout, so start with 30 days and step up (stop at your audit-log retention). Repeating it is safe because it replaces the stored usage rather than adding to it.</w:t>
       </w:r>
     </w:p>
     <w:p>
@@ -4444,7 +5249,151 @@
         <w:t xml:space="preserve">AppHost: SharePoint</w:t>
       </w:r>
       <w:r>
-        <w:t xml:space="preserve"> and will be broken out by agent name in future versions.</w:t>
+        <w:t xml:space="preserve"> and are also tracked per agent (see below).</w:t>
+      </w:r>
+    </w:p>
+    <w:p>
+      <w:pPr>
+        <w:pStyle w:val="BodyText"/>
+      </w:pPr>
+      <w:r>
+        <w:rPr>
+          <w:b/>
+          <w:bCs/>
+        </w:rPr>
+        <w:t xml:space="preserve">Usage tracking. </w:t>
+      </w:r>
+      <w:r>
+        <w:t xml:space="preserve">Every 4 hours, </w:t>
+      </w:r>
+      <w:r>
+        <w:rPr>
+          <w:rStyle w:val="VerbatimChar"/>
+        </w:rPr>
+        <w:t xml:space="preserve">ExportAdoptionMetrics</w:t>
+      </w:r>
+      <w:r>
+        <w:t xml:space="preserve"> reads new interaction blobs and counts, per agent, the number of uses and the most recent use (from </w:t>
+      </w:r>
+      <w:r>
+        <w:rPr>
+          <w:rStyle w:val="VerbatimChar"/>
+        </w:rPr>
+        <w:t xml:space="preserve">TargetAgentName</w:t>
+      </w:r>
+      <w:r>
+        <w:t xml:space="preserve"> and </w:t>
+      </w:r>
+      <w:r>
+        <w:rPr>
+          <w:rStyle w:val="VerbatimChar"/>
+        </w:rPr>
+        <w:t xml:space="preserve">TargetPlatformAgentId</w:t>
+      </w:r>
+      <w:r>
+        <w:t xml:space="preserve">). The running totals are kept in the </w:t>
+      </w:r>
+      <w:r>
+        <w:rPr>
+          <w:rStyle w:val="VerbatimChar"/>
+        </w:rPr>
+        <w:t xml:space="preserve">_state/agentUsage.json</w:t>
+      </w:r>
+      <w:r>
+        <w:t xml:space="preserve"> blob, and only newly seen blobs are added so nothing is double-counted. The totals are written to the registry columns </w:t>
+      </w:r>
+      <w:r>
+        <w:rPr>
+          <w:rStyle w:val="VerbatimChar"/>
+        </w:rPr>
+        <w:t xml:space="preserve">LastUsedDate</w:t>
+      </w:r>
+      <w:r>
+        <w:t xml:space="preserve">, </w:t>
+      </w:r>
+      <w:r>
+        <w:rPr>
+          <w:rStyle w:val="VerbatimChar"/>
+        </w:rPr>
+        <w:t xml:space="preserve">UseCount</w:t>
+      </w:r>
+      <w:r>
+        <w:t xml:space="preserve"> and </w:t>
+      </w:r>
+      <w:r>
+        <w:rPr>
+          <w:rStyle w:val="VerbatimChar"/>
+        </w:rPr>
+        <w:t xml:space="preserve">AgentPlatformID</w:t>
+      </w:r>
+      <w:r>
+        <w:t xml:space="preserve"> (only on rows whose values changed; values never go backwards).</w:t>
+      </w:r>
+    </w:p>
+    <w:p>
+      <w:pPr>
+        <w:pStyle w:val="BodyText"/>
+      </w:pPr>
+      <w:r>
+        <w:rPr>
+          <w:b/>
+          <w:bCs/>
+        </w:rPr>
+        <w:t xml:space="preserve">Matching usage to registry rows. </w:t>
+      </w:r>
+      <w:r>
+        <w:t xml:space="preserve">Audit events carry the agent display name, which may not equal the </w:t>
+      </w:r>
+      <w:r>
+        <w:rPr>
+          <w:rStyle w:val="VerbatimChar"/>
+        </w:rPr>
+        <w:t xml:space="preserve">.agent</w:t>
+      </w:r>
+      <w:r>
+        <w:t xml:space="preserve"> file name, so a row is matched first by its stored </w:t>
+      </w:r>
+      <w:r>
+        <w:rPr>
+          <w:rStyle w:val="VerbatimChar"/>
+        </w:rPr>
+        <w:t xml:space="preserve">AgentPlatformID</w:t>
+      </w:r>
+      <w:r>
+        <w:t xml:space="preserve">, then by agent name (case-insensitive; narrowed by site when several rows share a name). The platform ID is stored on the row the first time it matches, so later runs use it. Usage that matches no row (for example built-in agents such as Word Drafting Agent) is not lost; it is listed in the function log under “Usage not matched to a registry row”.</w:t>
+      </w:r>
+    </w:p>
+    <w:p>
+      <w:pPr>
+        <w:pStyle w:val="BodyText"/>
+      </w:pPr>
+      <w:r>
+        <w:rPr>
+          <w:b/>
+          <w:bCs/>
+        </w:rPr>
+        <w:t xml:space="preserve">Inactive agents. </w:t>
+      </w:r>
+      <w:r>
+        <w:t xml:space="preserve">On every export, the </w:t>
+      </w:r>
+      <w:r>
+        <w:rPr>
+          <w:rStyle w:val="VerbatimChar"/>
+        </w:rPr>
+        <w:t xml:space="preserve">CopilotInactiveAgents</w:t>
+      </w:r>
+      <w:r>
+        <w:t xml:space="preserve"> list is cleared and rewritten with a Summary row (total agents, inactive count) and one row per registry agent whose last use (or creation date, if never used) is at least </w:t>
+      </w:r>
+      <w:r>
+        <w:rPr>
+          <w:rStyle w:val="VerbatimChar"/>
+        </w:rPr>
+        <w:t xml:space="preserve">AGENT_INACTIVE_DAYS</w:t>
+      </w:r>
+      <w:r>
+        <w:t xml:space="preserve"> days ago (default 60). An agent that is used again drops off the list on the next run after its use reaches the audit feed, which can lag 15 to 60+ minutes, plus up to 4 hours for the next export. The registry is append-only, so a deleted agent still counts in the total until its row is removed by hand.</w:t>
       </w:r>
     </w:p>
     <w:p>
@@ -4669,6 +5618,81 @@
       </w:r>
     </w:p>
     <w:bookmarkEnd w:id="38"/>
+    <w:p>
+      <w:pPr>
+        <w:pStyle w:val="Heading2"/>
+      </w:pPr>
+      <w:r>
+        <w:t xml:space="preserve">SharePoint calls fail with 401 Unauthorized</w:t>
+      </w:r>
+    </w:p>
+    <w:p>
+      <w:pPr>
+        <w:pStyle w:val="FirstParagraph"/>
+      </w:pPr>
+      <w:r>
+        <w:t xml:space="preserve">The identity is missing the Sites.Selected app role or the site-level write grant (Step 2b). Reads can look empty rather than failing, so a function may log “Deleted 0 item(s)” before the first write returns 401. Check both grants. If both are in place and 401 continues, the app is probably holding a cached managed-identity token issued before the role was assigned. Tokens are cached for up to about 24 hours per resource and a restart does not clear them. Wait for it to expire, or request the SharePoint token with a trailing slash on the resource (</w:t>
+      </w:r>
+      <w:r>
+        <w:rPr>
+          <w:rStyle w:val="VerbatimChar"/>
+        </w:rPr>
+        <w:t xml:space="preserve">https://&lt;tenant&gt;.sharepoint.com/</w:t>
+      </w:r>
+      <w:r>
+        <w:t xml:space="preserve">), which uses a separate cache entry. ExportAdoptionMetrics already does this.</w:t>
+      </w:r>
+    </w:p>
+    <w:p>
+      <w:pPr>
+        <w:pStyle w:val="Heading2"/>
+      </w:pPr>
+      <w:r>
+        <w:t xml:space="preserve">400 Bad Request: “field or property does not exist”</w:t>
+      </w:r>
+    </w:p>
+    <w:p>
+      <w:pPr>
+        <w:pStyle w:val="FirstParagraph"/>
+      </w:pPr>
+      <w:r>
+        <w:t xml:space="preserve">A list column is missing, or its internal name differs from what the function writes. The warning in the function log includes SharePoint’s reason and names the first offending column. Typical causes are a typo that was later renamed (the internal name keeps the typo), different capitalisation (</w:t>
+      </w:r>
+      <w:r>
+        <w:rPr>
+          <w:rStyle w:val="VerbatimChar"/>
+        </w:rPr>
+        <w:t xml:space="preserve">AgentPlatformID</w:t>
+      </w:r>
+      <w:r>
+        <w:t xml:space="preserve"> vs </w:t>
+      </w:r>
+      <w:r>
+        <w:rPr>
+          <w:rStyle w:val="VerbatimChar"/>
+        </w:rPr>
+        <w:t xml:space="preserve">AgentPlatformId</w:t>
+      </w:r>
+      <w:r>
+        <w:t xml:space="preserve">), or a column created with the wrong type (for example InactiveCount as text instead of Number, which fails with “Cannot convert a primitive value to the expected type Edm.String”). Delete and recreate the column with the exact name and type.</w:t>
+      </w:r>
+    </w:p>
+    <w:p>
+      <w:pPr>
+        <w:pStyle w:val="Heading2"/>
+      </w:pPr>
+      <w:r>
+        <w:t xml:space="preserve">An agent stays on the inactive list after it was used</w:t>
+      </w:r>
+    </w:p>
+    <w:p>
+      <w:pPr>
+        <w:pStyle w:val="FirstParagraph"/>
+      </w:pPr>
+      <w:r>
+        <w:t xml:space="preserve">Allow for audit-feed delay plus the 4-hour export schedule. Then check the ExportAdoptionMetrics log for “Usage not matched to a registry row”. If the agent appears there, its display name in the audit event differs from AgentName in the registry; correct the registry AgentName (or AgentPlatformID) so they match.</w:t>
+      </w:r>
+    </w:p>
     <w:bookmarkStart w:id="39" w:name="duplicates-in-metrics-lists"/>
     <w:p>
       <w:pPr>
@@ -5664,6 +6688,162 @@
             </w:pPr>
             <w:r>
               <w:t xml:space="preserve">ExportAdoptionMetrics cron</w:t>
+            </w:r>
+          </w:p>
+        </w:tc>
+      </w:tr>
+      <w:tr>
+        <w:tc>
+          <w:tcPr/>
+          <w:p>
+            <w:pPr>
+              <w:pStyle w:val="Compact"/>
+            </w:pPr>
+            <w:r>
+              <w:rPr>
+                <w:rStyle w:val="VerbatimChar"/>
+              </w:rPr>
+              <w:t xml:space="preserve">SHAREPOINT_INACTIVE_AGENT_LIST</w:t>
+            </w:r>
+          </w:p>
+        </w:tc>
+        <w:tc>
+          <w:tcPr/>
+          <w:p>
+            <w:pPr>
+              <w:pStyle w:val="Compact"/>
+            </w:pPr>
+            <w:r>
+              <w:rPr>
+                <w:rStyle w:val="VerbatimChar"/>
+              </w:rPr>
+              <w:t xml:space="preserve">CopilotInactiveAgents</w:t>
+            </w:r>
+          </w:p>
+        </w:tc>
+        <w:tc>
+          <w:tcPr/>
+          <w:p>
+            <w:pPr>
+              <w:pStyle w:val="Compact"/>
+            </w:pPr>
+            <w:r>
+              <w:t xml:space="preserve">Both</w:t>
+            </w:r>
+          </w:p>
+        </w:tc>
+        <w:tc>
+          <w:tcPr/>
+          <w:p>
+            <w:pPr>
+              <w:pStyle w:val="Compact"/>
+            </w:pPr>
+            <w:r>
+              <w:t xml:space="preserve">Inactive-agent summary list, rewritten each export</w:t>
+            </w:r>
+          </w:p>
+        </w:tc>
+      </w:tr>
+      <w:tr>
+        <w:tc>
+          <w:tcPr/>
+          <w:p>
+            <w:pPr>
+              <w:pStyle w:val="Compact"/>
+            </w:pPr>
+            <w:r>
+              <w:rPr>
+                <w:rStyle w:val="VerbatimChar"/>
+              </w:rPr>
+              <w:t xml:space="preserve">AGENT_INACTIVE_DAYS</w:t>
+            </w:r>
+          </w:p>
+        </w:tc>
+        <w:tc>
+          <w:tcPr/>
+          <w:p>
+            <w:pPr>
+              <w:pStyle w:val="Compact"/>
+            </w:pPr>
+            <w:r>
+              <w:rPr>
+                <w:rStyle w:val="VerbatimChar"/>
+              </w:rPr>
+              <w:t xml:space="preserve">60</w:t>
+            </w:r>
+          </w:p>
+        </w:tc>
+        <w:tc>
+          <w:tcPr/>
+          <w:p>
+            <w:pPr>
+              <w:pStyle w:val="Compact"/>
+            </w:pPr>
+            <w:r>
+              <w:t xml:space="preserve">Both</w:t>
+            </w:r>
+          </w:p>
+        </w:tc>
+        <w:tc>
+          <w:tcPr/>
+          <w:p>
+            <w:pPr>
+              <w:pStyle w:val="Compact"/>
+            </w:pPr>
+            <w:r>
+              <w:t xml:space="preserve">Days without use before an agent is listed as inactive</w:t>
+            </w:r>
+          </w:p>
+        </w:tc>
+      </w:tr>
+      <w:tr>
+        <w:tc>
+          <w:tcPr/>
+          <w:p>
+            <w:pPr>
+              <w:pStyle w:val="Compact"/>
+            </w:pPr>
+            <w:r>
+              <w:rPr>
+                <w:rStyle w:val="VerbatimChar"/>
+              </w:rPr>
+              <w:t xml:space="preserve">AGENT_USAGE_REBUILD_DAYS</w:t>
+            </w:r>
+          </w:p>
+        </w:tc>
+        <w:tc>
+          <w:tcPr/>
+          <w:p>
+            <w:pPr>
+              <w:pStyle w:val="Compact"/>
+            </w:pPr>
+            <w:r>
+              <w:rPr>
+                <w:rStyle w:val="VerbatimChar"/>
+              </w:rPr>
+              <w:t xml:space="preserve">0</w:t>
+            </w:r>
+          </w:p>
+        </w:tc>
+        <w:tc>
+          <w:tcPr/>
+          <w:p>
+            <w:pPr>
+              <w:pStyle w:val="Compact"/>
+            </w:pPr>
+            <w:r>
+              <w:t xml:space="preserve">Both</w:t>
+            </w:r>
+          </w:p>
+        </w:tc>
+        <w:tc>
+          <w:tcPr/>
+          <w:p>
+            <w:pPr>
+              <w:pStyle w:val="Compact"/>
+            </w:pPr>
+            <w:r>
+              <w:t xml:space="preserve">One-time rebuild of agent usage from the last N days of blobs; reset to 0 afterwards</w:t>
             </w:r>
           </w:p>
         </w:tc>

</xml_diff>

<commit_message>
Docs: reliability and failure handling, failed-run alert
README and implementation guide: describe retries, progress tracking, agent
poller watermarks, export safeguards, the optional alertEmailAddress parameter,
limits, and a troubleshooting entry for failed runs. Add SharedHelpers.ps1 to
the repo structure.

Co-authored-by: Copilot <223556219+Copilot@users.noreply.github.com>
</commit_message>
<xml_diff>
--- a/Full_Implementation_Guide_No_Bicep.docx
+++ b/Full_Implementation_Guide_No_Bicep.docx
@@ -5437,6 +5437,194 @@
       </w:r>
     </w:p>
     <w:bookmarkEnd w:id="34"/>
+    <w:p>
+      <w:pPr>
+        <w:pStyle w:val="Heading1"/>
+      </w:pPr>
+      <w:r>
+        <w:t xml:space="preserve">Reliability and Failure Handling</w:t>
+      </w:r>
+    </w:p>
+    <w:p>
+      <w:pPr>
+        <w:pStyle w:val="FirstParagraph"/>
+      </w:pPr>
+      <w:r>
+        <w:t xml:space="preserve">The Office 365 Management API, Azure Storage and SharePoint can all throttle (HTTP 429) or fail transiently. The functions share one helper, </w:t>
+      </w:r>
+      <w:r>
+        <w:rPr>
+          <w:rStyle w:val="VerbatimChar"/>
+        </w:rPr>
+        <w:t xml:space="preserve">SharedHelpers.ps1</w:t>
+      </w:r>
+      <w:r>
+        <w:t xml:space="preserve">, so they all behave the same way:</w:t>
+      </w:r>
+    </w:p>
+    <w:p>
+      <w:pPr>
+        <w:pStyle w:val="BodyText"/>
+      </w:pPr>
+      <w:r>
+        <w:rPr>
+          <w:b/>
+          <w:bCs/>
+        </w:rPr>
+        <w:t xml:space="preserve">Retries. </w:t>
+      </w:r>
+      <w:r>
+        <w:t xml:space="preserve">Every Management API, storage and SharePoint call retries HTTP 408, 429, 500, 502, 503, 504 and network errors up to 5 times with exponential backoff, waiting as long as the server’s Retry-After header asks (capped at 60 seconds, plus a little jitter). Errors that retrying cannot fix (400, 401, 403, 404) fail immediately.</w:t>
+      </w:r>
+    </w:p>
+    <w:p>
+      <w:pPr>
+        <w:pStyle w:val="BodyText"/>
+      </w:pPr>
+      <w:r>
+        <w:rPr>
+          <w:b/>
+          <w:bCs/>
+        </w:rPr>
+        <w:t xml:space="preserve">Progress only advances on success. </w:t>
+      </w:r>
+      <w:r>
+        <w:rPr>
+          <w:rStyle w:val="VerbatimChar"/>
+        </w:rPr>
+        <w:t xml:space="preserve">PullCopilotAudit</w:t>
+      </w:r>
+      <w:r>
+        <w:t xml:space="preserve"> saves its processed-up-to time only after every storage and Log Analytics write has succeeded. If a write still fails after its retries, the run fails and the same window is read again next time. Storage blobs are named from a hash of the Management API content id and written with If-None-Match, so reading a window twice never creates duplicate blobs. Log Analytics can receive an event twice after such a re-read; every event carries a unique Id column, so de-duplicate in KQL with </w:t>
+      </w:r>
+      <w:r>
+        <w:rPr>
+          <w:rStyle w:val="VerbatimChar"/>
+        </w:rPr>
+        <w:t xml:space="preserve">summarize arg_max(TimeGenerated, *) by Id</w:t>
+      </w:r>
+      <w:r>
+        <w:t xml:space="preserve"> if it matters. A write rejected as permanently bad (400/413) is logged and skipped so one bad payload cannot block the pipeline.</w:t>
+      </w:r>
+    </w:p>
+    <w:p>
+      <w:pPr>
+        <w:pStyle w:val="BodyText"/>
+      </w:pPr>
+      <w:r>
+        <w:rPr>
+          <w:b/>
+          <w:bCs/>
+        </w:rPr>
+        <w:t xml:space="preserve">Agent pollers. </w:t>
+      </w:r>
+      <w:r>
+        <w:rPr>
+          <w:rStyle w:val="VerbatimChar"/>
+        </w:rPr>
+        <w:t xml:space="preserve">PullSharePointAgents</w:t>
+      </w:r>
+      <w:r>
+        <w:t xml:space="preserve"> and </w:t>
+      </w:r>
+      <w:r>
+        <w:rPr>
+          <w:rStyle w:val="VerbatimChar"/>
+        </w:rPr>
+        <w:t xml:space="preserve">PullCopilotStudioAgents</w:t>
+      </w:r>
+      <w:r>
+        <w:t xml:space="preserve"> keep their own processed-up-to blob in the </w:t>
+      </w:r>
+      <w:r>
+        <w:rPr>
+          <w:rStyle w:val="VerbatimChar"/>
+        </w:rPr>
+        <w:t xml:space="preserve">_state</w:t>
+      </w:r>
+      <w:r>
+        <w:t xml:space="preserve"> folder. A failed run (for example an audit content blob that could not be fetched) fails visibly and the next run re-reads from the last successful time. The window is never shorter than the configured window and never longer than 23 hours. Registry writes are de-duplicated, and a failed read of the registry stops the run rather than risking duplicate rows.</w:t>
+      </w:r>
+    </w:p>
+    <w:p>
+      <w:pPr>
+        <w:pStyle w:val="BodyText"/>
+      </w:pPr>
+      <w:r>
+        <w:rPr>
+          <w:b/>
+          <w:bCs/>
+        </w:rPr>
+        <w:t xml:space="preserve">Metrics export. </w:t>
+      </w:r>
+      <w:r>
+        <w:t xml:space="preserve">A state blob that cannot be read is an error, never “no state” (which would overwrite good data with an empty copy); only a missing blob (404) counts as no state. An interaction blob that cannot be downloaded is left unseen so the next run retries it, and its date is not finalized until it has been read. A list item that cannot be deleted stops the rewrite before anything is written, so rows are never duplicated.</w:t>
+      </w:r>
+    </w:p>
+    <w:p>
+      <w:pPr>
+        <w:pStyle w:val="BodyText"/>
+      </w:pPr>
+      <w:r>
+        <w:rPr>
+          <w:b/>
+          <w:bCs/>
+        </w:rPr>
+        <w:t xml:space="preserve">Failed-run alert. </w:t>
+      </w:r>
+      <w:r>
+        <w:t xml:space="preserve">When Log Analytics and Application Insights are deployed, the template creates a log-search alert named </w:t>
+      </w:r>
+      <w:r>
+        <w:rPr>
+          <w:rStyle w:val="VerbatimChar"/>
+        </w:rPr>
+        <w:t xml:space="preserve">alert-&lt;function-app&gt;-failed-runs</w:t>
+      </w:r>
+      <w:r>
+        <w:t xml:space="preserve">. It is evaluated every 15 minutes over a one-hour window and fires when a 15-minute function has failed twice, or when ExportAdoptionMetrics has failed once. Pass the template parameter </w:t>
+      </w:r>
+      <w:r>
+        <w:rPr>
+          <w:rStyle w:val="VerbatimChar"/>
+        </w:rPr>
+        <w:t xml:space="preserve">alertEmailAddress</w:t>
+      </w:r>
+      <w:r>
+        <w:t xml:space="preserve"> to also create an action group that emails that address; without it the alert still appears under Azure Monitor &gt; Alerts. In a storage-only deployment (</w:t>
+      </w:r>
+      <w:r>
+        <w:rPr>
+          <w:rStyle w:val="VerbatimChar"/>
+        </w:rPr>
+        <w:t xml:space="preserve">deployLogAnalytics=false</w:t>
+      </w:r>
+      <w:r>
+        <w:t xml:space="preserve">) there is no Application Insights, so no alert is created.</w:t>
+      </w:r>
+    </w:p>
+    <w:p>
+      <w:pPr>
+        <w:pStyle w:val="BlockText"/>
+      </w:pPr>
+      <w:r>
+        <w:rPr>
+          <w:b/>
+          <w:bCs/>
+        </w:rPr>
+        <w:t xml:space="preserve">Limits:</w:t>
+      </w:r>
+      <w:r>
+        <w:t xml:space="preserve"> the audit API only serves the last 24 hours of content by time window, so if failures last longer than about 23 hours the oldest window cannot be re-read from the API (events already written to the ADLS container are kept). A retry that straddles UTC midnight can write one duplicate storage blob under the next day’s folder.</w:t>
+      </w:r>
+    </w:p>
+    <w:p>
+      <w:r>
+        <w:pict>
+          <v:rect style="width:0;height:1.5pt" o:hralign="center" o:hrstd="t" o:hr="t"/>
+        </w:pict>
+      </w:r>
+    </w:p>
     <w:bookmarkStart w:id="40" w:name="troubleshooting"/>
     <w:p>
       <w:pPr>
@@ -5691,6 +5879,31 @@
       </w:pPr>
       <w:r>
         <w:t xml:space="preserve">Allow for audit-feed delay plus the 4-hour export schedule. Then check the ExportAdoptionMetrics log for “Usage not matched to a registry row”. If the agent appears there, its display name in the audit event differs from AgentName in the registry; correct the registry AgentName (or AgentPlatformID) so they match.</w:t>
+      </w:r>
+    </w:p>
+    <w:p>
+      <w:pPr>
+        <w:pStyle w:val="Heading2"/>
+      </w:pPr>
+      <w:r>
+        <w:t xml:space="preserve">A failed-run alert fired, or a function shows Failed</w:t>
+      </w:r>
+    </w:p>
+    <w:p>
+      <w:pPr>
+        <w:pStyle w:val="FirstParagraph"/>
+      </w:pPr>
+      <w:r>
+        <w:t xml:space="preserve">In Application Insights, run </w:t>
+      </w:r>
+      <w:r>
+        <w:rPr>
+          <w:rStyle w:val="VerbatimChar"/>
+        </w:rPr>
+        <w:t xml:space="preserve">traces | where operation_Name == 'PullCopilotAudit' | where message has_any ('WARNING','EXCEPTION','Retrying')</w:t>
+      </w:r>
+      <w:r>
+        <w:t xml:space="preserve"> (substitute the function name). “Retrying in Ns (attempt x/5)” lines show throttling or transient errors being absorbed; a run that still failed lists the final HTTP status. 429 and 5xx that persist for five attempts mean the Management API, storage or SharePoint is throttling or unavailable: the next 15-minute run picks the same window up again, so no action is needed unless failures continue for hours. 401/403 means a permission or token problem (see Step 2b and the 401 entry above); 400 on a SharePoint write means a column name or type is wrong. Because failed runs do not advance the processed-up-to time, fix the cause and the backlog is read automatically, up to 23 hours back (the Management API limit).</w:t>
       </w:r>
     </w:p>
     <w:bookmarkStart w:id="39" w:name="duplicates-in-metrics-lists"/>

</xml_diff>